<commit_message>
feat(Biometrico): Se implementa habilitación de ingreso por cédula y manuales
</commit_message>
<xml_diff>
--- a/intaladores y manuales biometrico/Manuales/Manual configuracion pluginBiometrico.docx
+++ b/intaladores y manuales biometrico/Manuales/Manual configuracion pluginBiometrico.docx
@@ -1,6 +1,6 @@
 
 <file path=word/document.xml><?xml version="1.0" encoding="utf-8"?>
-<w:document xmlns:wpc="http://schemas.microsoft.com/office/word/2010/wordprocessingCanvas" xmlns:cx="http://schemas.microsoft.com/office/drawing/2014/chartex" xmlns:cx1="http://schemas.microsoft.com/office/drawing/2015/9/8/chartex" xmlns:cx2="http://schemas.microsoft.com/office/drawing/2015/10/21/chartex" xmlns:cx3="http://schemas.microsoft.com/office/drawing/2016/5/9/chartex" xmlns:cx4="http://schemas.microsoft.com/office/drawing/2016/5/10/chartex" xmlns:cx5="http://schemas.microsoft.com/office/drawing/2016/5/11/chartex" xmlns:cx6="http://schemas.microsoft.com/office/drawing/2016/5/12/chartex" xmlns:cx7="http://schemas.microsoft.com/office/drawing/2016/5/13/chartex" xmlns:cx8="http://schemas.microsoft.com/office/drawing/2016/5/14/chartex" xmlns:mc="http://schemas.openxmlformats.org/markup-compatibility/2006" xmlns:aink="http://schemas.microsoft.com/office/drawing/2016/ink" xmlns:am3d="http://schemas.microsoft.com/office/drawing/2017/model3d" xmlns:o="urn:schemas-microsoft-com:office:office" xmlns:oel="http://schemas.microsoft.com/office/2019/extlst" xmlns:r="http://schemas.openxmlformats.org/officeDocument/2006/relationships" xmlns:m="http://schemas.openxmlformats.org/officeDocument/2006/math" xmlns:v="urn:schemas-microsoft-com:vml" xmlns:wp14="http://schemas.microsoft.com/office/word/2010/wordprocessingDrawing" xmlns:wp="http://schemas.openxmlformats.org/drawingml/2006/wordprocessingDrawing" xmlns:w10="urn:schemas-microsoft-com:office:word" xmlns:w="http://schemas.openxmlformats.org/wordprocessingml/2006/main" xmlns:w14="http://schemas.microsoft.com/office/word/2010/wordml" xmlns:w15="http://schemas.microsoft.com/office/word/2012/wordml" xmlns:w16cex="http://schemas.microsoft.com/office/word/2018/wordml/cex" xmlns:w16cid="http://schemas.microsoft.com/office/word/2016/wordml/cid" xmlns:w16="http://schemas.microsoft.com/office/word/2018/wordml" xmlns:w16sdtdh="http://schemas.microsoft.com/office/word/2020/wordml/sdtdatahash" xmlns:w16se="http://schemas.microsoft.com/office/word/2015/wordml/symex" xmlns:wpg="http://schemas.microsoft.com/office/word/2010/wordprocessingGroup" xmlns:wpi="http://schemas.microsoft.com/office/word/2010/wordprocessingInk" xmlns:wne="http://schemas.microsoft.com/office/word/2006/wordml" xmlns:wps="http://schemas.microsoft.com/office/word/2010/wordprocessingShape" mc:Ignorable="w14 w15 w16se w16cid w16 w16cex w16sdtdh wp14">
+<w:document xmlns:wpc="http://schemas.microsoft.com/office/word/2010/wordprocessingCanvas" xmlns:cx="http://schemas.microsoft.com/office/drawing/2014/chartex" xmlns:cx1="http://schemas.microsoft.com/office/drawing/2015/9/8/chartex" xmlns:cx2="http://schemas.microsoft.com/office/drawing/2015/10/21/chartex" xmlns:cx3="http://schemas.microsoft.com/office/drawing/2016/5/9/chartex" xmlns:cx4="http://schemas.microsoft.com/office/drawing/2016/5/10/chartex" xmlns:cx5="http://schemas.microsoft.com/office/drawing/2016/5/11/chartex" xmlns:cx6="http://schemas.microsoft.com/office/drawing/2016/5/12/chartex" xmlns:cx7="http://schemas.microsoft.com/office/drawing/2016/5/13/chartex" xmlns:cx8="http://schemas.microsoft.com/office/drawing/2016/5/14/chartex" xmlns:mc="http://schemas.openxmlformats.org/markup-compatibility/2006" xmlns:aink="http://schemas.microsoft.com/office/drawing/2016/ink" xmlns:am3d="http://schemas.microsoft.com/office/drawing/2017/model3d" xmlns:o="urn:schemas-microsoft-com:office:office" xmlns:oel="http://schemas.microsoft.com/office/2019/extlst" xmlns:r="http://schemas.openxmlformats.org/officeDocument/2006/relationships" xmlns:m="http://schemas.openxmlformats.org/officeDocument/2006/math" xmlns:v="urn:schemas-microsoft-com:vml" xmlns:wp14="http://schemas.microsoft.com/office/word/2010/wordprocessingDrawing" xmlns:wp="http://schemas.openxmlformats.org/drawingml/2006/wordprocessingDrawing" xmlns:w10="urn:schemas-microsoft-com:office:word" xmlns:w="http://schemas.openxmlformats.org/wordprocessingml/2006/main" xmlns:w14="http://schemas.microsoft.com/office/word/2010/wordml" xmlns:w15="http://schemas.microsoft.com/office/word/2012/wordml" xmlns:w16cex="http://schemas.microsoft.com/office/word/2018/wordml/cex" xmlns:w16cid="http://schemas.microsoft.com/office/word/2016/wordml/cid" xmlns:w16="http://schemas.microsoft.com/office/word/2018/wordml" xmlns:w16du="http://schemas.microsoft.com/office/word/2023/wordml/word16du" xmlns:w16sdtdh="http://schemas.microsoft.com/office/word/2020/wordml/sdtdatahash" xmlns:w16sdtfl="http://schemas.microsoft.com/office/word/2024/wordml/sdtformatlock" xmlns:w16se="http://schemas.microsoft.com/office/word/2015/wordml/symex" xmlns:wpg="http://schemas.microsoft.com/office/word/2010/wordprocessingGroup" xmlns:wpi="http://schemas.microsoft.com/office/word/2010/wordprocessingInk" xmlns:wne="http://schemas.microsoft.com/office/word/2006/wordml" xmlns:wps="http://schemas.microsoft.com/office/word/2010/wordprocessingShape" mc:Ignorable="w14 w15 w16se w16cid w16 w16cex w16sdtdh w16sdtfl w16du wp14">
   <w:body>
     <w:p/>
     <w:p/>
@@ -16,10 +16,10 @@
           <w:noProof/>
         </w:rPr>
         <w:drawing>
-          <wp:inline distT="0" distB="0" distL="0" distR="0" wp14:anchorId="56F0BDB6" wp14:editId="6CAAD4B8">
-            <wp:extent cx="5605145" cy="2672080"/>
+          <wp:inline distT="0" distB="0" distL="0" distR="0" wp14:anchorId="1D40310C" wp14:editId="7BD4B240">
+            <wp:extent cx="5605145" cy="3735070"/>
             <wp:effectExtent l="0" t="0" r="0" b="0"/>
-            <wp:docPr id="2" name="Imagen 2" descr="Logotipo&#10;&#10;Descripción generada automáticamente"/>
+            <wp:docPr id="1675292215" name="Imagen 1"/>
             <wp:cNvGraphicFramePr>
               <a:graphicFrameLocks xmlns:a="http://schemas.openxmlformats.org/drawingml/2006/main" noChangeAspect="1"/>
             </wp:cNvGraphicFramePr>
@@ -27,13 +27,13 @@
               <a:graphicData uri="http://schemas.openxmlformats.org/drawingml/2006/picture">
                 <pic:pic xmlns:pic="http://schemas.openxmlformats.org/drawingml/2006/picture">
                   <pic:nvPicPr>
-                    <pic:cNvPr id="0" name="Imagen 1" descr="Logotipo&#10;&#10;Descripción generada automáticamente"/>
+                    <pic:cNvPr id="0" name="Picture 1"/>
                     <pic:cNvPicPr>
                       <a:picLocks noChangeAspect="1" noChangeArrowheads="1"/>
                     </pic:cNvPicPr>
                   </pic:nvPicPr>
                   <pic:blipFill>
-                    <a:blip r:embed="rId4">
+                    <a:blip r:embed="rId4" cstate="print">
                       <a:extLst>
                         <a:ext uri="{28A0092B-C50C-407E-A947-70E740481C1C}">
                           <a14:useLocalDpi xmlns:a14="http://schemas.microsoft.com/office/drawing/2010/main" val="0"/>
@@ -48,7 +48,7 @@
                   <pic:spPr bwMode="auto">
                     <a:xfrm>
                       <a:off x="0" y="0"/>
-                      <a:ext cx="5605145" cy="2672080"/>
+                      <a:ext cx="5605145" cy="3735070"/>
                     </a:xfrm>
                     <a:prstGeom prst="rect">
                       <a:avLst/>
@@ -107,9 +107,12 @@
           <w:sz w:val="32"/>
           <w:szCs w:val="32"/>
         </w:rPr>
-        <w:t>CONFIGURACIÓN DEL PLUGIN BIOMÉTRICO</w:t>
-      </w:r>
-      <w:r>
+        <w:t>CONFIGURACIÓN DEL PLUGIN BIOMÉTRICO.</w:t>
+      </w:r>
+    </w:p>
+    <w:p>
+      <w:pPr>
+        <w:jc w:val="center"/>
         <w:rPr>
           <w:rFonts w:ascii="Arial" w:hAnsi="Arial" w:cs="Arial"/>
           <w:b/>
@@ -117,8 +120,7 @@
           <w:sz w:val="32"/>
           <w:szCs w:val="32"/>
         </w:rPr>
-        <w:t>.</w:t>
-      </w:r>
+      </w:pPr>
     </w:p>
     <w:p>
       <w:pPr>
@@ -158,7 +160,7 @@
     </w:p>
     <w:p>
       <w:pPr>
-        <w:jc w:val="center"/>
+        <w:spacing w:line="480" w:lineRule="auto"/>
         <w:rPr>
           <w:rFonts w:ascii="Arial" w:hAnsi="Arial" w:cs="Arial"/>
           <w:b/>
@@ -168,18 +170,6 @@
         </w:rPr>
       </w:pPr>
     </w:p>
-    <w:p>
-      <w:pPr>
-        <w:spacing w:line="480" w:lineRule="auto"/>
-        <w:rPr>
-          <w:rFonts w:ascii="Arial" w:hAnsi="Arial" w:cs="Arial"/>
-          <w:b/>
-          <w:bCs/>
-          <w:sz w:val="32"/>
-          <w:szCs w:val="32"/>
-        </w:rPr>
-      </w:pPr>
-    </w:p>
     <w:p/>
     <w:p>
       <w:pPr>
@@ -187,8 +177,13 @@
         <w:ind w:firstLine="708"/>
       </w:pPr>
       <w:r>
-        <w:lastRenderedPageBreak/>
-        <w:t xml:space="preserve">El plugin es un software que se vincula al de la intranet el cual se encarga de capturar un token que genera la huella dactilar. Este se encuentra en la carpeta de </w:t>
+        <w:t xml:space="preserve">El plugin es un software que se vincula al de </w:t>
+      </w:r>
+      <w:r>
+        <w:t xml:space="preserve">registro de usuario </w:t>
+      </w:r>
+      <w:r>
+        <w:t xml:space="preserve">el cual se encarga de capturar un token que genera la huella dactilar. Este se encuentra en la carpeta de </w:t>
       </w:r>
       <w:r>
         <w:t>instaladores</w:t>
@@ -378,6 +373,7 @@
         <w:rPr>
           <w:noProof/>
         </w:rPr>
+        <w:lastRenderedPageBreak/>
         <w:t>Acceda al ejectable para iniciar con la configuracion. Para configurarlo es necesario tener estos link</w:t>
       </w:r>
       <w:r>
@@ -399,7 +395,6 @@
         <w:rPr>
           <w:noProof/>
         </w:rPr>
-        <w:lastRenderedPageBreak/>
         <w:drawing>
           <wp:inline distT="0" distB="0" distL="0" distR="0" wp14:anchorId="5EAF8139" wp14:editId="1A80A87B">
             <wp:extent cx="3314700" cy="2553738"/>
@@ -468,7 +463,14 @@
             <w:rStyle w:val="Hipervnculo"/>
             <w:noProof/>
           </w:rPr>
-          <w:t>https://bermudas.site/Bermudas/huella/Model/HabilitarSensor.php</w:t>
+          <w:t>https://registrousuarios.edmaramericas.com/Model</w:t>
+        </w:r>
+        <w:r>
+          <w:rPr>
+            <w:rStyle w:val="Hipervnculo"/>
+            <w:noProof/>
+          </w:rPr>
+          <w:t>/HabilitarSensor.php</w:t>
         </w:r>
       </w:hyperlink>
     </w:p>
@@ -557,7 +559,14 @@
             <w:rStyle w:val="Hipervnculo"/>
             <w:noProof/>
           </w:rPr>
-          <w:t>https://bermudas.site/Bermudas/huella/Model/UsuarioRestApi.php</w:t>
+          <w:t>https://registrousuarios.edmaramericas.com/Model</w:t>
+        </w:r>
+        <w:r>
+          <w:rPr>
+            <w:rStyle w:val="Hipervnculo"/>
+            <w:noProof/>
+          </w:rPr>
+          <w:t>/UsuarioRestApi.php</w:t>
         </w:r>
       </w:hyperlink>
     </w:p>
@@ -629,7 +638,31 @@
         <w:rPr>
           <w:noProof/>
         </w:rPr>
-        <w:t>En el campo del token debe ingresar el token se genera para su computador el cual puede encontrar en la parte superior de la pantalla al acceder al modulo de ingreso de personal, registro e ingreso biometrico. El cual comienza con la palabra token y finaliza en un valor numerico.</w:t>
+        <w:t xml:space="preserve">En el campo del token debe ingresar el token se genera </w:t>
+      </w:r>
+      <w:r>
+        <w:rPr>
+          <w:noProof/>
+        </w:rPr>
+        <w:t xml:space="preserve">su navegador en la plataforma </w:t>
+      </w:r>
+      <w:r>
+        <w:rPr>
+          <w:noProof/>
+        </w:rPr>
+        <w:t xml:space="preserve">el cual puede encontrar </w:t>
+      </w:r>
+      <w:r>
+        <w:rPr>
+          <w:noProof/>
+        </w:rPr>
+        <w:t>especificado en la plataforma</w:t>
+      </w:r>
+      <w:r>
+        <w:rPr>
+          <w:noProof/>
+        </w:rPr>
+        <w:t xml:space="preserve">. </w:t>
       </w:r>
     </w:p>
     <w:p>
@@ -646,6 +679,46 @@
           <w:noProof/>
         </w:rPr>
         <w:lastRenderedPageBreak/>
+        <w:drawing>
+          <wp:inline distT="0" distB="0" distL="0" distR="0" wp14:anchorId="2490111F" wp14:editId="3F44F76B">
+            <wp:extent cx="5612130" cy="2355215"/>
+            <wp:effectExtent l="0" t="0" r="7620" b="6985"/>
+            <wp:docPr id="1053185287" name="Imagen 1"/>
+            <wp:cNvGraphicFramePr>
+              <a:graphicFrameLocks xmlns:a="http://schemas.openxmlformats.org/drawingml/2006/main" noChangeAspect="1"/>
+            </wp:cNvGraphicFramePr>
+            <a:graphic xmlns:a="http://schemas.openxmlformats.org/drawingml/2006/main">
+              <a:graphicData uri="http://schemas.openxmlformats.org/drawingml/2006/picture">
+                <pic:pic xmlns:pic="http://schemas.openxmlformats.org/drawingml/2006/picture">
+                  <pic:nvPicPr>
+                    <pic:cNvPr id="1053185287" name=""/>
+                    <pic:cNvPicPr/>
+                  </pic:nvPicPr>
+                  <pic:blipFill>
+                    <a:blip r:embed="rId13"/>
+                    <a:stretch>
+                      <a:fillRect/>
+                    </a:stretch>
+                  </pic:blipFill>
+                  <pic:spPr>
+                    <a:xfrm>
+                      <a:off x="0" y="0"/>
+                      <a:ext cx="5612130" cy="2355215"/>
+                    </a:xfrm>
+                    <a:prstGeom prst="rect">
+                      <a:avLst/>
+                    </a:prstGeom>
+                  </pic:spPr>
+                </pic:pic>
+              </a:graphicData>
+            </a:graphic>
+          </wp:inline>
+        </w:drawing>
+      </w:r>
+      <w:r>
+        <w:rPr>
+          <w:noProof/>
+        </w:rPr>
         <w:drawing>
           <wp:inline distT="0" distB="0" distL="0" distR="0" wp14:anchorId="21F92DF7" wp14:editId="6F651EE4">
             <wp:extent cx="2943225" cy="666750"/>
@@ -662,7 +735,7 @@
                     <pic:cNvPicPr/>
                   </pic:nvPicPr>
                   <pic:blipFill>
-                    <a:blip r:embed="rId13"/>
+                    <a:blip r:embed="rId14"/>
                     <a:stretch>
                       <a:fillRect/>
                     </a:stretch>
@@ -695,18 +768,10 @@
           <w:noProof/>
         </w:rPr>
         <w:drawing>
-          <wp:anchor distT="0" distB="0" distL="114300" distR="114300" simplePos="0" relativeHeight="251658240" behindDoc="0" locked="0" layoutInCell="1" allowOverlap="1" wp14:anchorId="122AE028" wp14:editId="5CC8BD10">
-            <wp:simplePos x="0" y="0"/>
-            <wp:positionH relativeFrom="column">
-              <wp:posOffset>1272540</wp:posOffset>
-            </wp:positionH>
-            <wp:positionV relativeFrom="paragraph">
-              <wp:posOffset>5080</wp:posOffset>
-            </wp:positionV>
-            <wp:extent cx="1857375" cy="247650"/>
-            <wp:effectExtent l="0" t="0" r="9525" b="0"/>
-            <wp:wrapNone/>
-            <wp:docPr id="10" name="Imagen 10"/>
+          <wp:inline distT="0" distB="0" distL="0" distR="0" wp14:anchorId="4143AA5B" wp14:editId="7DB2329A">
+            <wp:extent cx="5612130" cy="2355215"/>
+            <wp:effectExtent l="0" t="0" r="7620" b="6985"/>
+            <wp:docPr id="1975835610" name="Imagen 1"/>
             <wp:cNvGraphicFramePr>
               <a:graphicFrameLocks xmlns:a="http://schemas.openxmlformats.org/drawingml/2006/main" noChangeAspect="1"/>
             </wp:cNvGraphicFramePr>
@@ -714,17 +779,11 @@
               <a:graphicData uri="http://schemas.openxmlformats.org/drawingml/2006/picture">
                 <pic:pic xmlns:pic="http://schemas.openxmlformats.org/drawingml/2006/picture">
                   <pic:nvPicPr>
-                    <pic:cNvPr id="1" name=""/>
+                    <pic:cNvPr id="1975835610" name=""/>
                     <pic:cNvPicPr/>
                   </pic:nvPicPr>
                   <pic:blipFill>
-                    <a:blip r:embed="rId14">
-                      <a:extLst>
-                        <a:ext uri="{28A0092B-C50C-407E-A947-70E740481C1C}">
-                          <a14:useLocalDpi xmlns:a14="http://schemas.microsoft.com/office/drawing/2010/main" val="0"/>
-                        </a:ext>
-                      </a:extLst>
-                    </a:blip>
+                    <a:blip r:embed="rId13"/>
                     <a:stretch>
                       <a:fillRect/>
                     </a:stretch>
@@ -732,47 +791,7 @@
                   <pic:spPr>
                     <a:xfrm>
                       <a:off x="0" y="0"/>
-                      <a:ext cx="1857375" cy="247650"/>
-                    </a:xfrm>
-                    <a:prstGeom prst="rect">
-                      <a:avLst/>
-                    </a:prstGeom>
-                  </pic:spPr>
-                </pic:pic>
-              </a:graphicData>
-            </a:graphic>
-          </wp:anchor>
-        </w:drawing>
-      </w:r>
-      <w:r>
-        <w:rPr>
-          <w:noProof/>
-        </w:rPr>
-        <w:drawing>
-          <wp:inline distT="0" distB="0" distL="0" distR="0" wp14:anchorId="682292FA" wp14:editId="7CBC255E">
-            <wp:extent cx="6136877" cy="1314450"/>
-            <wp:effectExtent l="0" t="0" r="0" b="0"/>
-            <wp:docPr id="9" name="Imagen 9" descr="Interfaz de usuario gráfica&#10;&#10;Descripción generada automáticamente"/>
-            <wp:cNvGraphicFramePr>
-              <a:graphicFrameLocks xmlns:a="http://schemas.openxmlformats.org/drawingml/2006/main" noChangeAspect="1"/>
-            </wp:cNvGraphicFramePr>
-            <a:graphic xmlns:a="http://schemas.openxmlformats.org/drawingml/2006/main">
-              <a:graphicData uri="http://schemas.openxmlformats.org/drawingml/2006/picture">
-                <pic:pic xmlns:pic="http://schemas.openxmlformats.org/drawingml/2006/picture">
-                  <pic:nvPicPr>
-                    <pic:cNvPr id="9" name="Imagen 9" descr="Interfaz de usuario gráfica&#10;&#10;Descripción generada automáticamente"/>
-                    <pic:cNvPicPr/>
-                  </pic:nvPicPr>
-                  <pic:blipFill>
-                    <a:blip r:embed="rId15"/>
-                    <a:stretch>
-                      <a:fillRect/>
-                    </a:stretch>
-                  </pic:blipFill>
-                  <pic:spPr>
-                    <a:xfrm>
-                      <a:off x="0" y="0"/>
-                      <a:ext cx="6146047" cy="1316414"/>
+                      <a:ext cx="5612130" cy="2355215"/>
                     </a:xfrm>
                     <a:prstGeom prst="rect">
                       <a:avLst/>
@@ -797,7 +816,19 @@
         <w:rPr>
           <w:noProof/>
         </w:rPr>
-        <w:t xml:space="preserve">Para finalizar escoja el navegador donde desee configurar el plugin se recominda </w:t>
+        <w:t>Para finalizar escoja el navegador donde desee configurar el plugin se recomi</w:t>
+      </w:r>
+      <w:r>
+        <w:rPr>
+          <w:noProof/>
+        </w:rPr>
+        <w:t>e</w:t>
+      </w:r>
+      <w:r>
+        <w:rPr>
+          <w:noProof/>
+        </w:rPr>
+        <w:t xml:space="preserve">nda </w:t>
       </w:r>
       <w:r>
         <w:rPr>
@@ -831,7 +862,7 @@
                     <pic:cNvPicPr/>
                   </pic:nvPicPr>
                   <pic:blipFill>
-                    <a:blip r:embed="rId16"/>
+                    <a:blip r:embed="rId15"/>
                     <a:stretch>
                       <a:fillRect/>
                     </a:stretch>
@@ -870,11 +901,12 @@
         <w:rPr>
           <w:noProof/>
         </w:rPr>
+        <w:lastRenderedPageBreak/>
         <w:drawing>
-          <wp:inline distT="0" distB="0" distL="0" distR="0" wp14:anchorId="4B22AB8F" wp14:editId="44F3BB02">
-            <wp:extent cx="4296050" cy="3190875"/>
-            <wp:effectExtent l="0" t="0" r="9525" b="0"/>
-            <wp:docPr id="13" name="Imagen 13" descr="Interfaz de usuario gráfica, Aplicación&#10;&#10;Descripción generada automáticamente"/>
+          <wp:inline distT="0" distB="0" distL="0" distR="0" wp14:anchorId="0F85D4DE" wp14:editId="1C4406EB">
+            <wp:extent cx="5382376" cy="4096322"/>
+            <wp:effectExtent l="0" t="0" r="0" b="0"/>
+            <wp:docPr id="1729315397" name="Imagen 1"/>
             <wp:cNvGraphicFramePr>
               <a:graphicFrameLocks xmlns:a="http://schemas.openxmlformats.org/drawingml/2006/main" noChangeAspect="1"/>
             </wp:cNvGraphicFramePr>
@@ -882,11 +914,11 @@
               <a:graphicData uri="http://schemas.openxmlformats.org/drawingml/2006/picture">
                 <pic:pic xmlns:pic="http://schemas.openxmlformats.org/drawingml/2006/picture">
                   <pic:nvPicPr>
-                    <pic:cNvPr id="13" name="Imagen 13" descr="Interfaz de usuario gráfica, Aplicación&#10;&#10;Descripción generada automáticamente"/>
+                    <pic:cNvPr id="1729315397" name=""/>
                     <pic:cNvPicPr/>
                   </pic:nvPicPr>
                   <pic:blipFill>
-                    <a:blip r:embed="rId17"/>
+                    <a:blip r:embed="rId16"/>
                     <a:stretch>
                       <a:fillRect/>
                     </a:stretch>
@@ -894,7 +926,7 @@
                   <pic:spPr>
                     <a:xfrm>
                       <a:off x="0" y="0"/>
-                      <a:ext cx="4306433" cy="3198587"/>
+                      <a:ext cx="5382376" cy="4096322"/>
                     </a:xfrm>
                     <a:prstGeom prst="rect">
                       <a:avLst/>
@@ -912,7 +944,6 @@
         <w:spacing w:line="480" w:lineRule="auto"/>
       </w:pPr>
       <w:r>
-        <w:lastRenderedPageBreak/>
         <w:t xml:space="preserve">Para finalizar la configuración escoja la opción guardar. Y podrá ver que se genera un error o se preocupe esta valida que la </w:t>
       </w:r>
       <w:r>
@@ -950,7 +981,7 @@
                     <pic:cNvPicPr/>
                   </pic:nvPicPr>
                   <pic:blipFill>
-                    <a:blip r:embed="rId18"/>
+                    <a:blip r:embed="rId17"/>
                     <a:stretch>
                       <a:fillRect/>
                     </a:stretch>
@@ -998,6 +1029,7 @@
         <w:rPr>
           <w:noProof/>
         </w:rPr>
+        <w:lastRenderedPageBreak/>
         <w:drawing>
           <wp:inline distT="0" distB="0" distL="0" distR="0" wp14:anchorId="426AA60E" wp14:editId="10714D11">
             <wp:extent cx="2562225" cy="2781300"/>
@@ -1014,7 +1046,7 @@
                     <pic:cNvPicPr/>
                   </pic:nvPicPr>
                   <pic:blipFill>
-                    <a:blip r:embed="rId19"/>
+                    <a:blip r:embed="rId18"/>
                     <a:stretch>
                       <a:fillRect/>
                     </a:stretch>
@@ -1046,7 +1078,7 @@
 </file>
 
 <file path=word/styles.xml><?xml version="1.0" encoding="utf-8"?>
-<w:styles xmlns:mc="http://schemas.openxmlformats.org/markup-compatibility/2006" xmlns:r="http://schemas.openxmlformats.org/officeDocument/2006/relationships" xmlns:w="http://schemas.openxmlformats.org/wordprocessingml/2006/main" xmlns:w14="http://schemas.microsoft.com/office/word/2010/wordml" xmlns:w15="http://schemas.microsoft.com/office/word/2012/wordml" xmlns:w16cex="http://schemas.microsoft.com/office/word/2018/wordml/cex" xmlns:w16cid="http://schemas.microsoft.com/office/word/2016/wordml/cid" xmlns:w16="http://schemas.microsoft.com/office/word/2018/wordml" xmlns:w16sdtdh="http://schemas.microsoft.com/office/word/2020/wordml/sdtdatahash" xmlns:w16se="http://schemas.microsoft.com/office/word/2015/wordml/symex" mc:Ignorable="w14 w15 w16se w16cid w16 w16cex w16sdtdh">
+<w:styles xmlns:mc="http://schemas.openxmlformats.org/markup-compatibility/2006" xmlns:r="http://schemas.openxmlformats.org/officeDocument/2006/relationships" xmlns:w="http://schemas.openxmlformats.org/wordprocessingml/2006/main" xmlns:w14="http://schemas.microsoft.com/office/word/2010/wordml" xmlns:w15="http://schemas.microsoft.com/office/word/2012/wordml" xmlns:w16cex="http://schemas.microsoft.com/office/word/2018/wordml/cex" xmlns:w16cid="http://schemas.microsoft.com/office/word/2016/wordml/cid" xmlns:w16="http://schemas.microsoft.com/office/word/2018/wordml" xmlns:w16du="http://schemas.microsoft.com/office/word/2023/wordml/word16du" xmlns:w16sdtdh="http://schemas.microsoft.com/office/word/2020/wordml/sdtdatahash" xmlns:w16sdtfl="http://schemas.microsoft.com/office/word/2024/wordml/sdtformatlock" xmlns:w16se="http://schemas.microsoft.com/office/word/2015/wordml/symex" mc:Ignorable="w14 w15 w16se w16cid w16 w16cex w16sdtdh w16sdtfl w16du">
   <w:docDefaults>
     <w:rPrDefault>
       <w:rPr>

</xml_diff>